<commit_message>
Add CV formats recommendations and project timelines
</commit_message>
<xml_diff>
--- a/public/documents/Kazi-Hamidur-Rahman-CV.docx
+++ b/public/documents/Kazi-Hamidur-Rahman-CV.docx
@@ -69,25 +69,13 @@
         <w:jc w:val="center"/>
       </w:pPr>
       <w:r>
-        <w:t>QA Leadership | Test Automation | API Testing | Performance Testing | ERP/HRMS</w:t>
-      </w:r>
-      <w:r>
-        <w:t xml:space="preserve"> |</w:t>
-      </w:r>
-      <w:r>
-        <w:t xml:space="preserve"> E-Recruitment</w:t>
-      </w:r>
-      <w:r>
-        <w:t xml:space="preserve"> |</w:t>
-      </w:r>
-      <w:r>
-        <w:t xml:space="preserve"> Payroll</w:t>
-      </w:r>
-      <w:r>
-        <w:t xml:space="preserve"> |</w:t>
-      </w:r>
-      <w:r>
-        <w:t xml:space="preserve"> </w:t>
+        <w:t>AI-Driven Quality Engineering</w:t>
+      </w:r>
+      <w:r>
+        <w:t xml:space="preserve"> | </w:t>
+      </w:r>
+      <w:r>
+        <w:t xml:space="preserve">QA Leadership | Test Automation | API Testing | Performance Testing | </w:t>
       </w:r>
     </w:p>
     <w:p>
@@ -95,7 +83,25 @@
         <w:jc w:val="center"/>
       </w:pPr>
       <w:r>
-        <w:t>Procurement/e</w:t>
+        <w:t>ERP/HRMS</w:t>
+      </w:r>
+      <w:r>
+        <w:t xml:space="preserve"> |</w:t>
+      </w:r>
+      <w:r>
+        <w:t xml:space="preserve"> E-Recruitment</w:t>
+      </w:r>
+      <w:r>
+        <w:t xml:space="preserve"> |</w:t>
+      </w:r>
+      <w:r>
+        <w:t xml:space="preserve"> Payroll</w:t>
+      </w:r>
+      <w:r>
+        <w:t xml:space="preserve"> |</w:t>
+      </w:r>
+      <w:r>
+        <w:t xml:space="preserve"> Procurement/e</w:t>
       </w:r>
       <w:r>
         <w:t>-</w:t>
@@ -241,8 +247,13 @@
         <w:t xml:space="preserve">Performance: </w:t>
       </w:r>
       <w:r>
-        <w:t>K6, Apache JMeter, BlazeMeter</w:t>
-      </w:r>
+        <w:t xml:space="preserve">K6, Apache JMeter, </w:t>
+      </w:r>
+      <w:proofErr w:type="spellStart"/>
+      <w:r>
+        <w:t>BlazeMeter</w:t>
+      </w:r>
+      <w:proofErr w:type="spellEnd"/>
     </w:p>
     <w:p>
       <w:pPr>
@@ -493,8 +504,21 @@
         </w:rPr>
         <w:t xml:space="preserve">Key ERP Projects: </w:t>
       </w:r>
-      <w:r>
-        <w:t>sbiCloud ERP – BRAC International; sbiCloud ERP – BRAC Bangladesh.</w:t>
+      <w:proofErr w:type="spellStart"/>
+      <w:r>
+        <w:t>sbiCloud</w:t>
+      </w:r>
+      <w:proofErr w:type="spellEnd"/>
+      <w:r>
+        <w:t xml:space="preserve"> ERP – BRAC International; </w:t>
+      </w:r>
+      <w:proofErr w:type="spellStart"/>
+      <w:r>
+        <w:t>sbiCloud</w:t>
+      </w:r>
+      <w:proofErr w:type="spellEnd"/>
+      <w:r>
+        <w:t xml:space="preserve"> ERP – BRAC Bangladesh.</w:t>
       </w:r>
     </w:p>
     <w:p>
@@ -654,7 +678,15 @@
         <w:spacing w:after="30"/>
       </w:pPr>
       <w:r>
-        <w:t xml:space="preserve">Enterprise ERP / HRMS: Extensive QA involvement in sbiCloud ERP implementations for BRAC International and BRAC Bangladesh, covering enterprise HR and business processes. </w:t>
+        <w:t xml:space="preserve">Enterprise ERP / HRMS: Extensive QA involvement in </w:t>
+      </w:r>
+      <w:proofErr w:type="spellStart"/>
+      <w:r>
+        <w:t>sbiCloud</w:t>
+      </w:r>
+      <w:proofErr w:type="spellEnd"/>
+      <w:r>
+        <w:t xml:space="preserve"> ERP implementations for BRAC International and BRAC Bangladesh, covering enterprise HR and business processes. </w:t>
       </w:r>
     </w:p>
     <w:p>
@@ -681,7 +713,23 @@
         <w:spacing w:after="30"/>
       </w:pPr>
       <w:r>
-        <w:t xml:space="preserve">Procurement / eTender: Testing and quality validation of procurement and eTender-related workflows and business processes. </w:t>
+        <w:t xml:space="preserve">Procurement / </w:t>
+      </w:r>
+      <w:proofErr w:type="spellStart"/>
+      <w:r>
+        <w:t>eTender</w:t>
+      </w:r>
+      <w:proofErr w:type="spellEnd"/>
+      <w:r>
+        <w:t xml:space="preserve">: Testing and quality validation of procurement and </w:t>
+      </w:r>
+      <w:proofErr w:type="spellStart"/>
+      <w:r>
+        <w:t>eTender</w:t>
+      </w:r>
+      <w:proofErr w:type="spellEnd"/>
+      <w:r>
+        <w:t xml:space="preserve">-related workflows and business processes. </w:t>
       </w:r>
     </w:p>
     <w:p>
@@ -717,7 +765,15 @@
         <w:spacing w:after="30"/>
       </w:pPr>
       <w:r>
-        <w:t xml:space="preserve">Performance Engineering: Load, stress and performance validation using K6, Apache JMeter and BlazeMeter. </w:t>
+        <w:t xml:space="preserve">Performance Engineering: Load, stress and performance validation using K6, Apache JMeter and </w:t>
+      </w:r>
+      <w:proofErr w:type="spellStart"/>
+      <w:r>
+        <w:t>BlazeMeter</w:t>
+      </w:r>
+      <w:proofErr w:type="spellEnd"/>
+      <w:r>
+        <w:t xml:space="preserve">. </w:t>
       </w:r>
     </w:p>
     <w:p>
@@ -915,7 +971,11 @@
         <w:t>Advanced Certificate for Management Professionals (ACMP</w:t>
       </w:r>
       <w:r>
-        <w:t xml:space="preserve"> 4.0</w:t>
+        <w:t xml:space="preserve"> </w:t>
+      </w:r>
+      <w:proofErr w:type="gramStart"/>
+      <w:r>
+        <w:t>4.0</w:t>
       </w:r>
       <w:r>
         <w:t>)</w:t>
@@ -928,7 +988,15 @@
           <w:sz w:val="16"/>
           <w:szCs w:val="20"/>
         </w:rPr>
-        <w:t xml:space="preserve">— </w:t>
+        <w:t>—</w:t>
+      </w:r>
+      <w:proofErr w:type="gramEnd"/>
+      <w:r>
+        <w:rPr>
+          <w:sz w:val="16"/>
+          <w:szCs w:val="20"/>
+        </w:rPr>
+        <w:t xml:space="preserve"> </w:t>
       </w:r>
       <w:r>
         <w:rPr>
@@ -1009,10 +1077,7 @@
         <w:t>Open-Source</w:t>
       </w:r>
       <w:r>
-        <w:t xml:space="preserve"> Collaboration </w:t>
-      </w:r>
-      <w:r>
-        <w:t xml:space="preserve">— </w:t>
+        <w:t xml:space="preserve"> Collaboration — </w:t>
       </w:r>
       <w:r>
         <w:rPr>
@@ -1035,8 +1100,16 @@
       <w:pPr>
         <w:pStyle w:val="Heading1"/>
         <w:shd w:val="clear" w:color="auto" w:fill="EDEDED"/>
-      </w:pPr>
-      <w:r>
+        <w:rPr>
+          <w:b w:val="0"/>
+          <w:bCs w:val="0"/>
+        </w:rPr>
+      </w:pPr>
+      <w:r>
+        <w:rPr>
+          <w:b w:val="0"/>
+          <w:bCs w:val="0"/>
+        </w:rPr>
         <w:lastRenderedPageBreak/>
         <w:t>LANGUAGES</w:t>
       </w:r>
@@ -1050,10 +1123,58 @@
       <w:pPr>
         <w:pStyle w:val="Heading1"/>
         <w:shd w:val="clear" w:color="auto" w:fill="EDEDED"/>
-      </w:pPr>
-      <w:r>
+        <w:rPr>
+          <w:b w:val="0"/>
+          <w:bCs w:val="0"/>
+        </w:rPr>
+      </w:pPr>
+      <w:r>
+        <w:rPr>
+          <w:b w:val="0"/>
+          <w:bCs w:val="0"/>
+        </w:rPr>
         <w:t>ADDITIONAL INFORMATION</w:t>
       </w:r>
+    </w:p>
+    <w:p>
+      <w:r>
+        <w:rPr>
+          <w:b/>
+          <w:bCs/>
+        </w:rPr>
+        <w:t>GitHub:</w:t>
+      </w:r>
+      <w:r>
+        <w:t xml:space="preserve"> </w:t>
+      </w:r>
+      <w:hyperlink r:id="rId6" w:history="1">
+        <w:r>
+          <w:rPr>
+            <w:rStyle w:val="Hyperlink"/>
+          </w:rPr>
+          <w:t>https://github.com/Kazihamid</w:t>
+        </w:r>
+      </w:hyperlink>
+    </w:p>
+    <w:p>
+      <w:r>
+        <w:rPr>
+          <w:b/>
+          <w:bCs/>
+        </w:rPr>
+        <w:t>LinkedIn:</w:t>
+      </w:r>
+      <w:r>
+        <w:t xml:space="preserve"> </w:t>
+      </w:r>
+      <w:hyperlink r:id="rId7" w:history="1">
+        <w:r>
+          <w:rPr>
+            <w:rStyle w:val="Hyperlink"/>
+          </w:rPr>
+          <w:t>https://www.linkedin.com/in/kazi-hamidur-rahman-56105525/</w:t>
+        </w:r>
+      </w:hyperlink>
     </w:p>
     <w:p>
       <w:r>
@@ -1940,7 +2061,6 @@
   <w:style w:type="character" w:default="1" w:styleId="DefaultParagraphFont">
     <w:name w:val="Default Paragraph Font"/>
     <w:uiPriority w:val="1"/>
-    <w:semiHidden/>
     <w:unhideWhenUsed/>
   </w:style>
   <w:style w:type="table" w:default="1" w:styleId="TableNormal">
@@ -12716,6 +12836,29 @@
         <w:shd w:val="clear" w:color="auto" w:fill="FBCAA2" w:themeFill="accent6" w:themeFillTint="7F"/>
       </w:tcPr>
     </w:tblStylePr>
+  </w:style>
+  <w:style w:type="character" w:styleId="Hyperlink">
+    <w:name w:val="Hyperlink"/>
+    <w:basedOn w:val="DefaultParagraphFont"/>
+    <w:uiPriority w:val="99"/>
+    <w:unhideWhenUsed/>
+    <w:rsid w:val="00754B87"/>
+    <w:rPr>
+      <w:color w:val="0000FF" w:themeColor="hyperlink"/>
+      <w:u w:val="single"/>
+    </w:rPr>
+  </w:style>
+  <w:style w:type="character" w:styleId="UnresolvedMention">
+    <w:name w:val="Unresolved Mention"/>
+    <w:basedOn w:val="DefaultParagraphFont"/>
+    <w:uiPriority w:val="99"/>
+    <w:semiHidden/>
+    <w:unhideWhenUsed/>
+    <w:rsid w:val="00754B87"/>
+    <w:rPr>
+      <w:color w:val="605E5C"/>
+      <w:shd w:val="clear" w:color="auto" w:fill="E1DFDD"/>
+    </w:rPr>
   </w:style>
 </w:styles>
 </file>

</xml_diff>